<commit_message>
Update Chunk Design Documentation.docx
</commit_message>
<xml_diff>
--- a/Documentation/Chunk Design Documentation.docx
+++ b/Documentation/Chunk Design Documentation.docx
@@ -1,58 +1,66 @@
 
 <file path=word/document.xml><?xml version="1.0" encoding="utf-8"?>
-<w:document xmlns:wpc="http://schemas.microsoft.com/office/word/2010/wordprocessingCanvas" xmlns:mc="http://schemas.openxmlformats.org/markup-compatibility/2006" xmlns:o="urn:schemas-microsoft-com:office:office" xmlns:r="http://schemas.openxmlformats.org/officeDocument/2006/relationships" xmlns:m="http://schemas.openxmlformats.org/officeDocument/2006/math" xmlns:v="urn:schemas-microsoft-com:vml" xmlns:wp14="http://schemas.microsoft.com/office/word/2010/wordprocessingDrawing" xmlns:wp="http://schemas.openxmlformats.org/drawingml/2006/wordprocessingDrawing" xmlns:w10="urn:schemas-microsoft-com:office:word" xmlns:w="http://schemas.openxmlformats.org/wordprocessingml/2006/main" xmlns:w14="http://schemas.microsoft.com/office/word/2010/wordml" xmlns:w15="http://schemas.microsoft.com/office/word/2012/wordml" xmlns:wpg="http://schemas.microsoft.com/office/word/2010/wordprocessingGroup" xmlns:wpi="http://schemas.microsoft.com/office/word/2010/wordprocessingInk" xmlns:wne="http://schemas.microsoft.com/office/word/2006/wordml" xmlns:wps="http://schemas.microsoft.com/office/word/2010/wordprocessingShape" xmlns:w16se="http://schemas.microsoft.com/office/word/2015/wordml/symex" xmlns:w16cid="http://schemas.microsoft.com/office/word/2016/wordml/cid" xmlns:w16="http://schemas.microsoft.com/office/word/2018/wordml" xmlns:w16cex="http://schemas.microsoft.com/office/word/2018/wordml/cex" xmlns:w16sdtdh="http://schemas.microsoft.com/office/word/2020/wordml/sdtdatahash" xmlns:w16sdtfl="http://schemas.microsoft.com/office/word/2024/wordml/sdtformatlock" xmlns:a="http://schemas.openxmlformats.org/drawingml/2006/main" xmlns:pic="http://schemas.openxmlformats.org/drawingml/2006/picture" xmlns:a14="http://schemas.microsoft.com/office/drawing/2010/main" mc:Ignorable="w14 w15 wp14 w16se w16cid w16 w16cex w16sdtdh w16sdtfl">
+<w:document xmlns:wpc="http://schemas.microsoft.com/office/word/2010/wordprocessingCanvas" xmlns:cx="http://schemas.microsoft.com/office/drawing/2014/chartex" xmlns:cx1="http://schemas.microsoft.com/office/drawing/2015/9/8/chartex" xmlns:cx2="http://schemas.microsoft.com/office/drawing/2015/10/21/chartex" xmlns:cx3="http://schemas.microsoft.com/office/drawing/2016/5/9/chartex" xmlns:cx4="http://schemas.microsoft.com/office/drawing/2016/5/10/chartex" xmlns:cx5="http://schemas.microsoft.com/office/drawing/2016/5/11/chartex" xmlns:cx6="http://schemas.microsoft.com/office/drawing/2016/5/12/chartex" xmlns:cx7="http://schemas.microsoft.com/office/drawing/2016/5/13/chartex" xmlns:cx8="http://schemas.microsoft.com/office/drawing/2016/5/14/chartex" xmlns:mc="http://schemas.openxmlformats.org/markup-compatibility/2006" xmlns:aink="http://schemas.microsoft.com/office/drawing/2016/ink" xmlns:am3d="http://schemas.microsoft.com/office/drawing/2017/model3d" xmlns:o="urn:schemas-microsoft-com:office:office" xmlns:oel="http://schemas.microsoft.com/office/2019/extlst" xmlns:r="http://schemas.openxmlformats.org/officeDocument/2006/relationships" xmlns:m="http://schemas.openxmlformats.org/officeDocument/2006/math" xmlns:v="urn:schemas-microsoft-com:vml" xmlns:wp14="http://schemas.microsoft.com/office/word/2010/wordprocessingDrawing" xmlns:wp="http://schemas.openxmlformats.org/drawingml/2006/wordprocessingDrawing" xmlns:w10="urn:schemas-microsoft-com:office:word" xmlns:w="http://schemas.openxmlformats.org/wordprocessingml/2006/main" xmlns:w14="http://schemas.microsoft.com/office/word/2010/wordml" xmlns:w15="http://schemas.microsoft.com/office/word/2012/wordml" xmlns:w16cex="http://schemas.microsoft.com/office/word/2018/wordml/cex" xmlns:w16cid="http://schemas.microsoft.com/office/word/2016/wordml/cid" xmlns:w16="http://schemas.microsoft.com/office/word/2018/wordml" xmlns:w16du="http://schemas.microsoft.com/office/word/2023/wordml/word16du" xmlns:w16sdtdh="http://schemas.microsoft.com/office/word/2020/wordml/sdtdatahash" xmlns:w16se="http://schemas.microsoft.com/office/word/2015/wordml/symex" xmlns:wpg="http://schemas.microsoft.com/office/word/2010/wordprocessingGroup" xmlns:wpi="http://schemas.microsoft.com/office/word/2010/wordprocessingInk" xmlns:wne="http://schemas.microsoft.com/office/word/2006/wordml" xmlns:wps="http://schemas.microsoft.com/office/word/2010/wordprocessingShape" mc:Ignorable="w14 w15 w16se w16cid w16 w16cex w16sdtdh w16du wp14">
   <w:body>
     <w:p>
-      <w:r>
-        <w:rPr/>
-        <w:t>It’s</w:t>
-      </w:r>
-      <w:r>
-        <w:rPr/>
-        <w:t xml:space="preserve"> important for the game to have plenty of </w:t>
-      </w:r>
-      <w:r>
-        <w:rPr/>
+      <w:pPr>
+        <w:rPr>
+          <w:b/>
+          <w:bCs/>
+        </w:rPr>
+      </w:pPr>
+      <w:r>
+        <w:rPr>
+          <w:b/>
+          <w:bCs/>
+        </w:rPr>
+        <w:t>Chunks - Overview</w:t>
+      </w:r>
+    </w:p>
+    <w:p>
+      <w:r>
+        <w:t xml:space="preserve">It’s important for the game to have plenty of </w:t>
+      </w:r>
+      <w:r>
         <w:t xml:space="preserve">different chunks </w:t>
       </w:r>
       <w:r>
-        <w:rPr/>
         <w:t xml:space="preserve">so </w:t>
       </w:r>
       <w:r>
-        <w:rPr/>
         <w:t xml:space="preserve">that </w:t>
       </w:r>
       <w:r>
-        <w:rPr/>
         <w:t xml:space="preserve">the player is constantly playing through obstacles that feel fresh and unique. This is a short guide on how to create new chunks and make sure they appear </w:t>
       </w:r>
       <w:r>
-        <w:rPr/>
         <w:t>in the game.</w:t>
       </w:r>
     </w:p>
     <w:p>
       <w:r>
+        <w:rPr>
+          <w:noProof/>
+        </w:rPr>
         <w:drawing>
-          <wp:inline wp14:editId="12421913" wp14:anchorId="5E989DFD">
+          <wp:inline distT="0" distB="0" distL="0" distR="0" wp14:anchorId="5E989DFD" wp14:editId="158A5C3D">
             <wp:extent cx="5943600" cy="1657350"/>
             <wp:effectExtent l="0" t="0" r="0" b="0"/>
             <wp:docPr id="1205159542" name="drawing"/>
             <wp:cNvGraphicFramePr>
-              <a:graphicFrameLocks noChangeAspect="1"/>
+              <a:graphicFrameLocks xmlns:a="http://schemas.openxmlformats.org/drawingml/2006/main" noChangeAspect="1"/>
             </wp:cNvGraphicFramePr>
-            <a:graphic>
-              <a:graphicData xmlns:a="http://schemas.openxmlformats.org/drawingml/2006/main" uri="http://schemas.openxmlformats.org/drawingml/2006/picture">
+            <a:graphic xmlns:a="http://schemas.openxmlformats.org/drawingml/2006/main">
+              <a:graphicData uri="http://schemas.openxmlformats.org/drawingml/2006/picture">
                 <pic:pic xmlns:pic="http://schemas.openxmlformats.org/drawingml/2006/picture">
                   <pic:nvPicPr>
                     <pic:cNvPr id="1205159542" name=""/>
                     <pic:cNvPicPr/>
                   </pic:nvPicPr>
                   <pic:blipFill>
-                    <a:blip xmlns:r="http://schemas.openxmlformats.org/officeDocument/2006/relationships" r:embed="rId1134710531">
+                    <a:blip r:embed="rId4" cstate="print">
                       <a:extLst>
-                        <a:ext xmlns:a="http://schemas.openxmlformats.org/drawingml/2006/main" uri="{28A0092B-C50C-407E-A947-70E740481C1C}">
+                        <a:ext uri="{28A0092B-C50C-407E-A947-70E740481C1C}">
                           <a14:useLocalDpi xmlns:a14="http://schemas.microsoft.com/office/drawing/2010/main" val="0"/>
                         </a:ext>
                       </a:extLst>
@@ -77,51 +85,39 @@
         </w:drawing>
       </w:r>
       <w:r>
-        <w:rPr/>
         <w:t>First, follow this file path</w:t>
       </w:r>
       <w:r>
-        <w:rPr/>
         <w:t xml:space="preserve"> (Assets -&gt; Prefabs -&gt; Chunks -&gt; Chunks)</w:t>
       </w:r>
       <w:r>
-        <w:rPr/>
-        <w:t xml:space="preserve"> to find </w:t>
-      </w:r>
-      <w:r>
-        <w:rPr/>
-        <w:t xml:space="preserve">all the chunks </w:t>
-      </w:r>
-      <w:r>
-        <w:rPr/>
-        <w:t>we’ve</w:t>
-      </w:r>
-      <w:r>
-        <w:rPr/>
-        <w:t xml:space="preserve"> made so far.</w:t>
-      </w:r>
-    </w:p>
-    <w:p>
-      <w:r>
+        <w:t xml:space="preserve"> to find all the chunks we’ve made so far.</w:t>
+      </w:r>
+    </w:p>
+    <w:p>
+      <w:r>
+        <w:rPr>
+          <w:noProof/>
+        </w:rPr>
         <w:drawing>
-          <wp:inline wp14:editId="7F6F16EC" wp14:anchorId="656EECFB">
+          <wp:inline distT="0" distB="0" distL="0" distR="0" wp14:anchorId="656EECFB" wp14:editId="4B8DAF49">
             <wp:extent cx="5943600" cy="3152775"/>
             <wp:effectExtent l="0" t="0" r="0" b="0"/>
             <wp:docPr id="913304690" name="drawing"/>
             <wp:cNvGraphicFramePr>
-              <a:graphicFrameLocks noChangeAspect="1"/>
+              <a:graphicFrameLocks xmlns:a="http://schemas.openxmlformats.org/drawingml/2006/main" noChangeAspect="1"/>
             </wp:cNvGraphicFramePr>
-            <a:graphic>
-              <a:graphicData xmlns:a="http://schemas.openxmlformats.org/drawingml/2006/main" uri="http://schemas.openxmlformats.org/drawingml/2006/picture">
+            <a:graphic xmlns:a="http://schemas.openxmlformats.org/drawingml/2006/main">
+              <a:graphicData uri="http://schemas.openxmlformats.org/drawingml/2006/picture">
                 <pic:pic xmlns:pic="http://schemas.openxmlformats.org/drawingml/2006/picture">
                   <pic:nvPicPr>
                     <pic:cNvPr id="913304690" name=""/>
                     <pic:cNvPicPr/>
                   </pic:nvPicPr>
                   <pic:blipFill>
-                    <a:blip xmlns:r="http://schemas.openxmlformats.org/officeDocument/2006/relationships" r:embed="rId725522074">
+                    <a:blip r:embed="rId5" cstate="print">
                       <a:extLst>
-                        <a:ext xmlns:a="http://schemas.openxmlformats.org/drawingml/2006/main" uri="{28A0092B-C50C-407E-A947-70E740481C1C}">
+                        <a:ext uri="{28A0092B-C50C-407E-A947-70E740481C1C}">
                           <a14:useLocalDpi xmlns:a14="http://schemas.microsoft.com/office/drawing/2010/main" val="0"/>
                         </a:ext>
                       </a:extLst>
@@ -146,33 +142,35 @@
         </w:drawing>
       </w:r>
       <w:r>
-        <w:rPr/>
         <w:t>Drag one into the AutoRunnerIn</w:t>
       </w:r>
       <w:r>
-        <w:rPr/>
         <w:t>finite scene.</w:t>
       </w:r>
     </w:p>
     <w:p>
       <w:r>
+        <w:rPr>
+          <w:noProof/>
+        </w:rPr>
+        <w:lastRenderedPageBreak/>
         <w:drawing>
-          <wp:inline wp14:editId="62268A2D" wp14:anchorId="072B59C0">
+          <wp:inline distT="0" distB="0" distL="0" distR="0" wp14:anchorId="072B59C0" wp14:editId="62268A2D">
             <wp:extent cx="4532619" cy="3457575"/>
             <wp:effectExtent l="0" t="0" r="0" b="0"/>
             <wp:docPr id="926440998" name="drawing"/>
             <wp:cNvGraphicFramePr>
-              <a:graphicFrameLocks noChangeAspect="1"/>
+              <a:graphicFrameLocks xmlns:a="http://schemas.openxmlformats.org/drawingml/2006/main" noChangeAspect="1"/>
             </wp:cNvGraphicFramePr>
-            <a:graphic>
-              <a:graphicData xmlns:a="http://schemas.openxmlformats.org/drawingml/2006/main" uri="http://schemas.openxmlformats.org/drawingml/2006/picture">
+            <a:graphic xmlns:a="http://schemas.openxmlformats.org/drawingml/2006/main">
+              <a:graphicData uri="http://schemas.openxmlformats.org/drawingml/2006/picture">
                 <pic:pic xmlns:pic="http://schemas.openxmlformats.org/drawingml/2006/picture">
                   <pic:nvPicPr>
                     <pic:cNvPr id="926440998" name=""/>
                     <pic:cNvPicPr/>
                   </pic:nvPicPr>
                   <pic:blipFill>
-                    <a:blip xmlns:r="http://schemas.openxmlformats.org/officeDocument/2006/relationships" r:embed="rId275321819">
+                    <a:blip r:embed="rId6">
                       <a:extLst>
                         <a:ext uri="{28A0092B-C50C-407E-A947-70E740481C1C}">
                           <a14:useLocalDpi xmlns:a14="http://schemas.microsoft.com/office/drawing/2010/main"/>
@@ -184,7 +182,7 @@
                     </a:stretch>
                   </pic:blipFill>
                   <pic:spPr>
-                    <a:xfrm rot="0">
+                    <a:xfrm>
                       <a:off x="0" y="0"/>
                       <a:ext cx="4532619" cy="3457575"/>
                     </a:xfrm>
@@ -201,45 +199,45 @@
     </w:p>
     <w:p>
       <w:r>
-        <w:rPr/>
         <w:t xml:space="preserve">Then right-click it, click on Prefab, then Unpack Completely. </w:t>
       </w:r>
       <w:r>
-        <w:rPr/>
         <w:t>Honestly,</w:t>
       </w:r>
       <w:r>
-        <w:rPr/>
-        <w:t xml:space="preserve"> Unpack is fine too; </w:t>
-      </w:r>
-      <w:r>
-        <w:rPr/>
-        <w:t>it’ll</w:t>
-      </w:r>
-      <w:r>
-        <w:rPr/>
-        <w:t xml:space="preserve"> keep the collectibles intact. But this documentation shows you what to do even if you click Unpack Completely.</w:t>
-      </w:r>
-    </w:p>
-    <w:p>
-      <w:r>
+        <w:t xml:space="preserve"> </w:t>
+      </w:r>
+      <w:proofErr w:type="gramStart"/>
+      <w:r>
+        <w:t>Unpack</w:t>
+      </w:r>
+      <w:proofErr w:type="gramEnd"/>
+      <w:r>
+        <w:t xml:space="preserve"> is fine too; it’ll keep the collectibles intact. But this documentation shows you what to do even if you click Unpack Completely.</w:t>
+      </w:r>
+    </w:p>
+    <w:p>
+      <w:r>
+        <w:rPr>
+          <w:noProof/>
+        </w:rPr>
         <w:drawing>
-          <wp:inline wp14:editId="19C2CCDF" wp14:anchorId="2FCCC58A">
+          <wp:inline distT="0" distB="0" distL="0" distR="0" wp14:anchorId="2FCCC58A" wp14:editId="19C2CCDF">
             <wp:extent cx="2753239" cy="2934109"/>
             <wp:effectExtent l="0" t="0" r="0" b="0"/>
             <wp:docPr id="266120162" name="drawing"/>
             <wp:cNvGraphicFramePr>
-              <a:graphicFrameLocks noChangeAspect="1"/>
+              <a:graphicFrameLocks xmlns:a="http://schemas.openxmlformats.org/drawingml/2006/main" noChangeAspect="1"/>
             </wp:cNvGraphicFramePr>
-            <a:graphic>
-              <a:graphicData xmlns:a="http://schemas.openxmlformats.org/drawingml/2006/main" uri="http://schemas.openxmlformats.org/drawingml/2006/picture">
+            <a:graphic xmlns:a="http://schemas.openxmlformats.org/drawingml/2006/main">
+              <a:graphicData uri="http://schemas.openxmlformats.org/drawingml/2006/picture">
                 <pic:pic xmlns:pic="http://schemas.openxmlformats.org/drawingml/2006/picture">
                   <pic:nvPicPr>
                     <pic:cNvPr id="266120162" name=""/>
                     <pic:cNvPicPr/>
                   </pic:nvPicPr>
                   <pic:blipFill>
-                    <a:blip xmlns:r="http://schemas.openxmlformats.org/officeDocument/2006/relationships" r:embed="rId2123298743">
+                    <a:blip r:embed="rId7">
                       <a:extLst>
                         <a:ext uri="{28A0092B-C50C-407E-A947-70E740481C1C}">
                           <a14:useLocalDpi xmlns:a14="http://schemas.microsoft.com/office/drawing/2010/main"/>
@@ -251,7 +249,7 @@
                     </a:stretch>
                   </pic:blipFill>
                   <pic:spPr>
-                    <a:xfrm rot="0">
+                    <a:xfrm>
                       <a:off x="0" y="0"/>
                       <a:ext cx="2753239" cy="2934109"/>
                     </a:xfrm>
@@ -268,15 +266,12 @@
     </w:p>
     <w:p>
       <w:r>
-        <w:rPr/>
         <w:t xml:space="preserve">Then rename it to a new number or give it </w:t>
       </w:r>
       <w:r>
-        <w:rPr/>
         <w:t>a</w:t>
       </w:r>
       <w:r>
-        <w:rPr/>
         <w:t xml:space="preserve"> descriptive name.</w:t>
       </w:r>
     </w:p>
@@ -284,25 +279,29 @@
     <w:p/>
     <w:p>
       <w:r>
+        <w:rPr>
+          <w:noProof/>
+        </w:rPr>
+        <w:lastRenderedPageBreak/>
         <w:drawing>
-          <wp:inline wp14:editId="2A3636B7" wp14:anchorId="4F159818">
+          <wp:inline distT="0" distB="0" distL="0" distR="0" wp14:anchorId="4F159818" wp14:editId="1C2827DB">
             <wp:extent cx="5943600" cy="4352925"/>
             <wp:effectExtent l="0" t="0" r="0" b="0"/>
             <wp:docPr id="1217865509" name="drawing"/>
             <wp:cNvGraphicFramePr>
-              <a:graphicFrameLocks noChangeAspect="1"/>
+              <a:graphicFrameLocks xmlns:a="http://schemas.openxmlformats.org/drawingml/2006/main" noChangeAspect="1"/>
             </wp:cNvGraphicFramePr>
-            <a:graphic>
-              <a:graphicData xmlns:a="http://schemas.openxmlformats.org/drawingml/2006/main" uri="http://schemas.openxmlformats.org/drawingml/2006/picture">
+            <a:graphic xmlns:a="http://schemas.openxmlformats.org/drawingml/2006/main">
+              <a:graphicData uri="http://schemas.openxmlformats.org/drawingml/2006/picture">
                 <pic:pic xmlns:pic="http://schemas.openxmlformats.org/drawingml/2006/picture">
                   <pic:nvPicPr>
                     <pic:cNvPr id="1217865509" name=""/>
                     <pic:cNvPicPr/>
                   </pic:nvPicPr>
                   <pic:blipFill>
-                    <a:blip xmlns:r="http://schemas.openxmlformats.org/officeDocument/2006/relationships" r:embed="rId136991300">
+                    <a:blip r:embed="rId8" cstate="print">
                       <a:extLst>
-                        <a:ext xmlns:a="http://schemas.openxmlformats.org/drawingml/2006/main" uri="{28A0092B-C50C-407E-A947-70E740481C1C}">
+                        <a:ext uri="{28A0092B-C50C-407E-A947-70E740481C1C}">
                           <a14:useLocalDpi xmlns:a14="http://schemas.microsoft.com/office/drawing/2010/main" val="0"/>
                         </a:ext>
                       </a:extLst>
@@ -327,39 +326,33 @@
         </w:drawing>
       </w:r>
       <w:r>
-        <w:rPr/>
-        <w:t xml:space="preserve">Turn it into a new </w:t>
-      </w:r>
-      <w:r>
-        <w:rPr/>
-        <w:t>prefab</w:t>
-      </w:r>
-      <w:r>
-        <w:rPr/>
-        <w:t xml:space="preserve"> by dragging it down into the Chunks folder.</w:t>
-      </w:r>
-    </w:p>
-    <w:p>
-      <w:r>
+        <w:t>Turn it into a new prefab by dragging it down into the Chunks folder.</w:t>
+      </w:r>
+    </w:p>
+    <w:p>
+      <w:r>
+        <w:rPr>
+          <w:noProof/>
+        </w:rPr>
         <w:drawing>
-          <wp:inline wp14:editId="26136F0F" wp14:anchorId="789D8A59">
+          <wp:inline distT="0" distB="0" distL="0" distR="0" wp14:anchorId="789D8A59" wp14:editId="44556C4A">
             <wp:extent cx="5943600" cy="3067050"/>
             <wp:effectExtent l="0" t="0" r="0" b="0"/>
             <wp:docPr id="1217189628" name="drawing"/>
             <wp:cNvGraphicFramePr>
-              <a:graphicFrameLocks noChangeAspect="1"/>
+              <a:graphicFrameLocks xmlns:a="http://schemas.openxmlformats.org/drawingml/2006/main" noChangeAspect="1"/>
             </wp:cNvGraphicFramePr>
-            <a:graphic>
-              <a:graphicData xmlns:a="http://schemas.openxmlformats.org/drawingml/2006/main" uri="http://schemas.openxmlformats.org/drawingml/2006/picture">
+            <a:graphic xmlns:a="http://schemas.openxmlformats.org/drawingml/2006/main">
+              <a:graphicData uri="http://schemas.openxmlformats.org/drawingml/2006/picture">
                 <pic:pic xmlns:pic="http://schemas.openxmlformats.org/drawingml/2006/picture">
                   <pic:nvPicPr>
                     <pic:cNvPr id="1217189628" name=""/>
                     <pic:cNvPicPr/>
                   </pic:nvPicPr>
                   <pic:blipFill>
-                    <a:blip xmlns:r="http://schemas.openxmlformats.org/officeDocument/2006/relationships" r:embed="rId354051957">
+                    <a:blip r:embed="rId9" cstate="print">
                       <a:extLst>
-                        <a:ext xmlns:a="http://schemas.openxmlformats.org/drawingml/2006/main" uri="{28A0092B-C50C-407E-A947-70E740481C1C}">
+                        <a:ext uri="{28A0092B-C50C-407E-A947-70E740481C1C}">
                           <a14:useLocalDpi xmlns:a14="http://schemas.microsoft.com/office/drawing/2010/main" val="0"/>
                         </a:ext>
                       </a:extLst>
@@ -384,39 +377,34 @@
         </w:drawing>
       </w:r>
       <w:r>
-        <w:rPr/>
-        <w:t xml:space="preserve">If you want to </w:t>
-      </w:r>
-      <w:r>
-        <w:rPr/>
-        <w:t>delete</w:t>
-      </w:r>
-      <w:r>
-        <w:rPr/>
-        <w:t xml:space="preserve"> the collectible objects, go ahead.</w:t>
-      </w:r>
-    </w:p>
-    <w:p>
-      <w:r>
+        <w:t>If you want to delete the collectible objects, go ahead.</w:t>
+      </w:r>
+    </w:p>
+    <w:p>
+      <w:r>
+        <w:rPr>
+          <w:noProof/>
+        </w:rPr>
+        <w:lastRenderedPageBreak/>
         <w:drawing>
-          <wp:inline wp14:editId="6D59391A" wp14:anchorId="6554A8AB">
+          <wp:inline distT="0" distB="0" distL="0" distR="0" wp14:anchorId="6554A8AB" wp14:editId="3429D822">
             <wp:extent cx="5943600" cy="2371725"/>
             <wp:effectExtent l="0" t="0" r="0" b="0"/>
             <wp:docPr id="813962750" name="drawing"/>
             <wp:cNvGraphicFramePr>
-              <a:graphicFrameLocks noChangeAspect="1"/>
+              <a:graphicFrameLocks xmlns:a="http://schemas.openxmlformats.org/drawingml/2006/main" noChangeAspect="1"/>
             </wp:cNvGraphicFramePr>
-            <a:graphic>
-              <a:graphicData xmlns:a="http://schemas.openxmlformats.org/drawingml/2006/main" uri="http://schemas.openxmlformats.org/drawingml/2006/picture">
+            <a:graphic xmlns:a="http://schemas.openxmlformats.org/drawingml/2006/main">
+              <a:graphicData uri="http://schemas.openxmlformats.org/drawingml/2006/picture">
                 <pic:pic xmlns:pic="http://schemas.openxmlformats.org/drawingml/2006/picture">
                   <pic:nvPicPr>
                     <pic:cNvPr id="813962750" name=""/>
                     <pic:cNvPicPr/>
                   </pic:nvPicPr>
                   <pic:blipFill>
-                    <a:blip xmlns:r="http://schemas.openxmlformats.org/officeDocument/2006/relationships" r:embed="rId954151593">
+                    <a:blip r:embed="rId10" cstate="print">
                       <a:extLst>
-                        <a:ext xmlns:a="http://schemas.openxmlformats.org/drawingml/2006/main" uri="{28A0092B-C50C-407E-A947-70E740481C1C}">
+                        <a:ext uri="{28A0092B-C50C-407E-A947-70E740481C1C}">
                           <a14:useLocalDpi xmlns:a14="http://schemas.microsoft.com/office/drawing/2010/main" val="0"/>
                         </a:ext>
                       </a:extLst>
@@ -443,35 +431,33 @@
     </w:p>
     <w:p>
       <w:r>
-        <w:rPr/>
-        <w:t>Now what you’ll find is there are two layers. “Tilemap” is everything that has physical interaction, like floors and walls.</w:t>
-      </w:r>
-      <w:r>
-        <w:rPr/>
-        <w:t xml:space="preserve"> </w:t>
-      </w:r>
-    </w:p>
-    <w:p>
-      <w:r>
+        <w:t xml:space="preserve">Now what you’ll find is there are two layers. “Tilemap” is everything that has physical interaction, like floors and walls. </w:t>
+      </w:r>
+    </w:p>
+    <w:p>
+      <w:r>
+        <w:rPr>
+          <w:noProof/>
+        </w:rPr>
         <w:drawing>
-          <wp:inline wp14:editId="465789CC" wp14:anchorId="0136B246">
+          <wp:inline distT="0" distB="0" distL="0" distR="0" wp14:anchorId="0136B246" wp14:editId="6C4F2ACC">
             <wp:extent cx="5943600" cy="2790825"/>
             <wp:effectExtent l="0" t="0" r="0" b="0"/>
             <wp:docPr id="1138309985" name="drawing"/>
             <wp:cNvGraphicFramePr>
-              <a:graphicFrameLocks noChangeAspect="1"/>
+              <a:graphicFrameLocks xmlns:a="http://schemas.openxmlformats.org/drawingml/2006/main" noChangeAspect="1"/>
             </wp:cNvGraphicFramePr>
-            <a:graphic>
-              <a:graphicData xmlns:a="http://schemas.openxmlformats.org/drawingml/2006/main" uri="http://schemas.openxmlformats.org/drawingml/2006/picture">
+            <a:graphic xmlns:a="http://schemas.openxmlformats.org/drawingml/2006/main">
+              <a:graphicData uri="http://schemas.openxmlformats.org/drawingml/2006/picture">
                 <pic:pic xmlns:pic="http://schemas.openxmlformats.org/drawingml/2006/picture">
                   <pic:nvPicPr>
                     <pic:cNvPr id="1138309985" name=""/>
                     <pic:cNvPicPr/>
                   </pic:nvPicPr>
                   <pic:blipFill>
-                    <a:blip xmlns:r="http://schemas.openxmlformats.org/officeDocument/2006/relationships" r:embed="rId972631571">
+                    <a:blip r:embed="rId11" cstate="print">
                       <a:extLst>
-                        <a:ext xmlns:a="http://schemas.openxmlformats.org/drawingml/2006/main" uri="{28A0092B-C50C-407E-A947-70E740481C1C}">
+                        <a:ext uri="{28A0092B-C50C-407E-A947-70E740481C1C}">
                           <a14:useLocalDpi xmlns:a14="http://schemas.microsoft.com/office/drawing/2010/main" val="0"/>
                         </a:ext>
                       </a:extLst>
@@ -496,48 +482,41 @@
         </w:drawing>
       </w:r>
       <w:r>
-        <w:rPr/>
         <w:t xml:space="preserve">“BG” is the background </w:t>
       </w:r>
       <w:r>
-        <w:rPr/>
         <w:t>layer and</w:t>
       </w:r>
       <w:r>
-        <w:rPr/>
-        <w:t xml:space="preserve"> </w:t>
-      </w:r>
-      <w:r>
-        <w:rPr/>
-        <w:t>represents</w:t>
-      </w:r>
-      <w:r>
-        <w:rPr/>
-        <w:t xml:space="preserve"> everything behind the player. No tiles on BG are physically interactive.</w:t>
+        <w:t xml:space="preserve"> represents everything behind the player. No tiles on BG are physically interactive.</w:t>
       </w:r>
     </w:p>
     <w:p/>
     <w:p>
       <w:r>
+        <w:rPr>
+          <w:noProof/>
+        </w:rPr>
+        <w:lastRenderedPageBreak/>
         <w:drawing>
-          <wp:inline wp14:editId="454D80B0" wp14:anchorId="03BB8CF9">
+          <wp:inline distT="0" distB="0" distL="0" distR="0" wp14:anchorId="03BB8CF9" wp14:editId="68C86ECA">
             <wp:extent cx="5943600" cy="2447925"/>
             <wp:effectExtent l="0" t="0" r="0" b="0"/>
             <wp:docPr id="2074868716" name="drawing"/>
             <wp:cNvGraphicFramePr>
-              <a:graphicFrameLocks noChangeAspect="1"/>
+              <a:graphicFrameLocks xmlns:a="http://schemas.openxmlformats.org/drawingml/2006/main" noChangeAspect="1"/>
             </wp:cNvGraphicFramePr>
-            <a:graphic>
-              <a:graphicData xmlns:a="http://schemas.openxmlformats.org/drawingml/2006/main" uri="http://schemas.openxmlformats.org/drawingml/2006/picture">
+            <a:graphic xmlns:a="http://schemas.openxmlformats.org/drawingml/2006/main">
+              <a:graphicData uri="http://schemas.openxmlformats.org/drawingml/2006/picture">
                 <pic:pic xmlns:pic="http://schemas.openxmlformats.org/drawingml/2006/picture">
                   <pic:nvPicPr>
                     <pic:cNvPr id="2074868716" name=""/>
                     <pic:cNvPicPr/>
                   </pic:nvPicPr>
                   <pic:blipFill>
-                    <a:blip xmlns:r="http://schemas.openxmlformats.org/officeDocument/2006/relationships" r:embed="rId852055697">
+                    <a:blip r:embed="rId12" cstate="print">
                       <a:extLst>
-                        <a:ext xmlns:a="http://schemas.openxmlformats.org/drawingml/2006/main" uri="{28A0092B-C50C-407E-A947-70E740481C1C}">
+                        <a:ext uri="{28A0092B-C50C-407E-A947-70E740481C1C}">
                           <a14:useLocalDpi xmlns:a14="http://schemas.microsoft.com/office/drawing/2010/main" val="0"/>
                         </a:ext>
                       </a:extLst>
@@ -562,43 +541,36 @@
         </w:drawing>
       </w:r>
       <w:r>
-        <w:rPr/>
-        <w:t xml:space="preserve">Using the tile palette, you can paint background and interactable tiles. I like starting from a blank slate like this, then </w:t>
-      </w:r>
-      <w:r>
-        <w:rPr/>
-        <w:t>modifying</w:t>
-      </w:r>
-      <w:r>
-        <w:rPr/>
-        <w:t xml:space="preserve"> </w:t>
-      </w:r>
-      <w:r>
-        <w:rPr/>
+        <w:t xml:space="preserve">Using the tile palette, you can paint background and interactable tiles. I like starting from a blank slate like this, then modifying </w:t>
+      </w:r>
+      <w:r>
         <w:t>it if I have an idea for a chunk.</w:t>
       </w:r>
     </w:p>
     <w:p>
       <w:r>
+        <w:rPr>
+          <w:noProof/>
+        </w:rPr>
         <w:drawing>
-          <wp:inline wp14:editId="3D5E46E8" wp14:anchorId="57844D84">
+          <wp:inline distT="0" distB="0" distL="0" distR="0" wp14:anchorId="57844D84" wp14:editId="3D5E46E8">
             <wp:extent cx="5943600" cy="3076575"/>
             <wp:effectExtent l="0" t="0" r="0" b="0"/>
             <wp:docPr id="39373748" name="drawing"/>
             <wp:cNvGraphicFramePr>
-              <a:graphicFrameLocks noChangeAspect="1"/>
+              <a:graphicFrameLocks xmlns:a="http://schemas.openxmlformats.org/drawingml/2006/main" noChangeAspect="1"/>
             </wp:cNvGraphicFramePr>
-            <a:graphic>
-              <a:graphicData xmlns:a="http://schemas.openxmlformats.org/drawingml/2006/main" uri="http://schemas.openxmlformats.org/drawingml/2006/picture">
+            <a:graphic xmlns:a="http://schemas.openxmlformats.org/drawingml/2006/main">
+              <a:graphicData uri="http://schemas.openxmlformats.org/drawingml/2006/picture">
                 <pic:pic xmlns:pic="http://schemas.openxmlformats.org/drawingml/2006/picture">
                   <pic:nvPicPr>
                     <pic:cNvPr id="39373748" name=""/>
                     <pic:cNvPicPr/>
                   </pic:nvPicPr>
                   <pic:blipFill>
-                    <a:blip xmlns:r="http://schemas.openxmlformats.org/officeDocument/2006/relationships" r:embed="rId76607225">
+                    <a:blip r:embed="rId13">
                       <a:extLst>
-                        <a:ext xmlns:a="http://schemas.openxmlformats.org/drawingml/2006/main" uri="{28A0092B-C50C-407E-A947-70E740481C1C}">
+                        <a:ext uri="{28A0092B-C50C-407E-A947-70E740481C1C}">
                           <a14:useLocalDpi xmlns:a14="http://schemas.microsoft.com/office/drawing/2010/main" val="0"/>
                         </a:ext>
                       </a:extLst>
@@ -623,39 +595,34 @@
         </w:drawing>
       </w:r>
       <w:r>
-        <w:rPr/>
-        <w:t xml:space="preserve">I populated this chunk with some platforms and a pit. I colored the background behind the pit with different colored tiles to </w:t>
-      </w:r>
-      <w:r>
-        <w:rPr/>
-        <w:t>indicate</w:t>
-      </w:r>
-      <w:r>
-        <w:rPr/>
-        <w:t xml:space="preserve"> to the player that there’s danger there.</w:t>
+        <w:t>I populated this chunk with some platforms and a pit. I colored the background behind the pit with different colored tiles to indicate to the player that there’s danger there.</w:t>
       </w:r>
     </w:p>
     <w:p/>
     <w:p/>
     <w:p>
       <w:r>
+        <w:rPr>
+          <w:noProof/>
+        </w:rPr>
+        <w:lastRenderedPageBreak/>
         <w:drawing>
-          <wp:inline wp14:editId="4B2ACDBA" wp14:anchorId="1AF5CD8D">
+          <wp:inline distT="0" distB="0" distL="0" distR="0" wp14:anchorId="1AF5CD8D" wp14:editId="4B2ACDBA">
             <wp:extent cx="4342923" cy="3333750"/>
             <wp:effectExtent l="0" t="0" r="0" b="0"/>
             <wp:docPr id="796676204" name="drawing"/>
             <wp:cNvGraphicFramePr>
-              <a:graphicFrameLocks noChangeAspect="1"/>
+              <a:graphicFrameLocks xmlns:a="http://schemas.openxmlformats.org/drawingml/2006/main" noChangeAspect="1"/>
             </wp:cNvGraphicFramePr>
-            <a:graphic>
-              <a:graphicData xmlns:a="http://schemas.openxmlformats.org/drawingml/2006/main" uri="http://schemas.openxmlformats.org/drawingml/2006/picture">
+            <a:graphic xmlns:a="http://schemas.openxmlformats.org/drawingml/2006/main">
+              <a:graphicData uri="http://schemas.openxmlformats.org/drawingml/2006/picture">
                 <pic:pic xmlns:pic="http://schemas.openxmlformats.org/drawingml/2006/picture">
                   <pic:nvPicPr>
                     <pic:cNvPr id="796676204" name=""/>
                     <pic:cNvPicPr/>
                   </pic:nvPicPr>
                   <pic:blipFill>
-                    <a:blip xmlns:r="http://schemas.openxmlformats.org/officeDocument/2006/relationships" r:embed="rId1304722671">
+                    <a:blip r:embed="rId14">
                       <a:extLst>
                         <a:ext uri="{28A0092B-C50C-407E-A947-70E740481C1C}">
                           <a14:useLocalDpi xmlns:a14="http://schemas.microsoft.com/office/drawing/2010/main"/>
@@ -667,7 +634,7 @@
                     </a:stretch>
                   </pic:blipFill>
                   <pic:spPr>
-                    <a:xfrm rot="0">
+                    <a:xfrm>
                       <a:off x="0" y="0"/>
                       <a:ext cx="4342923" cy="3333750"/>
                     </a:xfrm>
@@ -684,29 +651,31 @@
     </w:p>
     <w:p>
       <w:r>
-        <w:rPr/>
         <w:t>Now you can populate your chunk with collectibles. By default, all collectibles are coins.</w:t>
       </w:r>
     </w:p>
     <w:p>
       <w:r>
+        <w:rPr>
+          <w:noProof/>
+        </w:rPr>
         <w:drawing>
-          <wp:inline wp14:editId="7AD8F93D" wp14:anchorId="60898A5A">
+          <wp:inline distT="0" distB="0" distL="0" distR="0" wp14:anchorId="60898A5A" wp14:editId="7AD8F93D">
             <wp:extent cx="5320634" cy="3188970"/>
             <wp:effectExtent l="0" t="0" r="0" b="0"/>
             <wp:docPr id="1256745314" name="drawing"/>
             <wp:cNvGraphicFramePr>
-              <a:graphicFrameLocks noChangeAspect="1"/>
+              <a:graphicFrameLocks xmlns:a="http://schemas.openxmlformats.org/drawingml/2006/main" noChangeAspect="1"/>
             </wp:cNvGraphicFramePr>
-            <a:graphic>
-              <a:graphicData xmlns:a="http://schemas.openxmlformats.org/drawingml/2006/main" uri="http://schemas.openxmlformats.org/drawingml/2006/picture">
+            <a:graphic xmlns:a="http://schemas.openxmlformats.org/drawingml/2006/main">
+              <a:graphicData uri="http://schemas.openxmlformats.org/drawingml/2006/picture">
                 <pic:pic xmlns:pic="http://schemas.openxmlformats.org/drawingml/2006/picture">
                   <pic:nvPicPr>
                     <pic:cNvPr id="1256745314" name=""/>
                     <pic:cNvPicPr/>
                   </pic:nvPicPr>
                   <pic:blipFill>
-                    <a:blip xmlns:r="http://schemas.openxmlformats.org/officeDocument/2006/relationships" r:embed="rId191726392">
+                    <a:blip r:embed="rId15">
                       <a:extLst>
                         <a:ext uri="{28A0092B-C50C-407E-A947-70E740481C1C}">
                           <a14:useLocalDpi xmlns:a14="http://schemas.microsoft.com/office/drawing/2010/main"/>
@@ -718,7 +687,7 @@
                     </a:stretch>
                   </pic:blipFill>
                   <pic:spPr>
-                    <a:xfrm rot="0">
+                    <a:xfrm>
                       <a:off x="0" y="0"/>
                       <a:ext cx="5320634" cy="3188970"/>
                     </a:xfrm>
@@ -735,41 +704,32 @@
     </w:p>
     <w:p>
       <w:r>
-        <w:rPr/>
-        <w:t>You can make a collectible become a stamina pellet instead by clicking on Stamina from the</w:t>
-      </w:r>
-      <w:r>
-        <w:rPr/>
-        <w:t xml:space="preserve"> “Collectible Logic” script </w:t>
-      </w:r>
-      <w:r>
-        <w:rPr/>
-        <w:t>component</w:t>
-      </w:r>
-      <w:r>
-        <w:rPr/>
-        <w:t>.</w:t>
-      </w:r>
-    </w:p>
-    <w:p>
-      <w:r>
+        <w:t>You can make a collectible become a stamina pellet instead by clicking on Stamina from the “Collectible Logic” script component.</w:t>
+      </w:r>
+    </w:p>
+    <w:p>
+      <w:r>
+        <w:rPr>
+          <w:noProof/>
+        </w:rPr>
+        <w:lastRenderedPageBreak/>
         <w:drawing>
-          <wp:inline wp14:editId="0B408118" wp14:anchorId="09D7D20E">
+          <wp:inline distT="0" distB="0" distL="0" distR="0" wp14:anchorId="09D7D20E" wp14:editId="0B408118">
             <wp:extent cx="4746171" cy="4152900"/>
             <wp:effectExtent l="0" t="0" r="0" b="0"/>
             <wp:docPr id="831531816" name="drawing"/>
             <wp:cNvGraphicFramePr>
-              <a:graphicFrameLocks noChangeAspect="1"/>
+              <a:graphicFrameLocks xmlns:a="http://schemas.openxmlformats.org/drawingml/2006/main" noChangeAspect="1"/>
             </wp:cNvGraphicFramePr>
-            <a:graphic>
-              <a:graphicData xmlns:a="http://schemas.openxmlformats.org/drawingml/2006/main" uri="http://schemas.openxmlformats.org/drawingml/2006/picture">
+            <a:graphic xmlns:a="http://schemas.openxmlformats.org/drawingml/2006/main">
+              <a:graphicData uri="http://schemas.openxmlformats.org/drawingml/2006/picture">
                 <pic:pic xmlns:pic="http://schemas.openxmlformats.org/drawingml/2006/picture">
                   <pic:nvPicPr>
                     <pic:cNvPr id="831531816" name=""/>
                     <pic:cNvPicPr/>
                   </pic:nvPicPr>
                   <pic:blipFill>
-                    <a:blip xmlns:r="http://schemas.openxmlformats.org/officeDocument/2006/relationships" r:embed="rId98876845">
+                    <a:blip r:embed="rId16">
                       <a:extLst>
                         <a:ext uri="{28A0092B-C50C-407E-A947-70E740481C1C}">
                           <a14:useLocalDpi xmlns:a14="http://schemas.microsoft.com/office/drawing/2010/main"/>
@@ -781,7 +741,7 @@
                     </a:stretch>
                   </pic:blipFill>
                   <pic:spPr>
-                    <a:xfrm rot="0">
+                    <a:xfrm>
                       <a:off x="0" y="0"/>
                       <a:ext cx="4746171" cy="4152900"/>
                     </a:xfrm>
@@ -798,32 +758,34 @@
     </w:p>
     <w:p>
       <w:r>
-        <w:rPr/>
         <w:t>Also, the stamina pellets have this color (0BFF00) usually to indicate that they’re different.</w:t>
       </w:r>
     </w:p>
     <w:p/>
     <w:p>
       <w:r>
+        <w:rPr>
+          <w:noProof/>
+        </w:rPr>
         <w:drawing>
-          <wp:inline wp14:editId="3AF466E8" wp14:anchorId="11120FFB">
+          <wp:inline distT="0" distB="0" distL="0" distR="0" wp14:anchorId="11120FFB" wp14:editId="6B8F053A">
             <wp:extent cx="5943600" cy="1514475"/>
             <wp:effectExtent l="0" t="0" r="0" b="0"/>
             <wp:docPr id="301141326" name="drawing"/>
             <wp:cNvGraphicFramePr>
-              <a:graphicFrameLocks noChangeAspect="1"/>
+              <a:graphicFrameLocks xmlns:a="http://schemas.openxmlformats.org/drawingml/2006/main" noChangeAspect="1"/>
             </wp:cNvGraphicFramePr>
-            <a:graphic>
-              <a:graphicData xmlns:a="http://schemas.openxmlformats.org/drawingml/2006/main" uri="http://schemas.openxmlformats.org/drawingml/2006/picture">
+            <a:graphic xmlns:a="http://schemas.openxmlformats.org/drawingml/2006/main">
+              <a:graphicData uri="http://schemas.openxmlformats.org/drawingml/2006/picture">
                 <pic:pic xmlns:pic="http://schemas.openxmlformats.org/drawingml/2006/picture">
                   <pic:nvPicPr>
                     <pic:cNvPr id="301141326" name=""/>
                     <pic:cNvPicPr/>
                   </pic:nvPicPr>
                   <pic:blipFill>
-                    <a:blip xmlns:r="http://schemas.openxmlformats.org/officeDocument/2006/relationships" r:embed="rId172488485">
+                    <a:blip r:embed="rId17" cstate="print">
                       <a:extLst>
-                        <a:ext xmlns:a="http://schemas.openxmlformats.org/drawingml/2006/main" uri="{28A0092B-C50C-407E-A947-70E740481C1C}">
+                        <a:ext uri="{28A0092B-C50C-407E-A947-70E740481C1C}">
                           <a14:useLocalDpi xmlns:a14="http://schemas.microsoft.com/office/drawing/2010/main" val="0"/>
                         </a:ext>
                       </a:extLst>
@@ -848,52 +810,38 @@
         </w:drawing>
       </w:r>
       <w:r>
-        <w:rPr/>
-        <w:t xml:space="preserve">Now </w:t>
-      </w:r>
-      <w:r>
-        <w:rPr/>
-        <w:t>you’ve</w:t>
-      </w:r>
-      <w:r>
-        <w:rPr/>
-        <w:t xml:space="preserve"> finished the </w:t>
-      </w:r>
-      <w:r>
-        <w:rPr/>
-        <w:t>prefab</w:t>
-      </w:r>
-      <w:r>
-        <w:rPr/>
-        <w:t xml:space="preserve">. </w:t>
-      </w:r>
-      <w:r>
-        <w:rPr/>
+        <w:t xml:space="preserve">Now you’ve finished the prefab. </w:t>
+      </w:r>
+      <w:r>
         <w:t>Go to (Assets -&gt; Data -&gt; Chunks)</w:t>
       </w:r>
     </w:p>
     <w:p/>
     <w:p>
       <w:r>
+        <w:rPr>
+          <w:noProof/>
+        </w:rPr>
+        <w:lastRenderedPageBreak/>
         <w:drawing>
-          <wp:inline wp14:editId="2B7457CC" wp14:anchorId="5F6FBBDD">
+          <wp:inline distT="0" distB="0" distL="0" distR="0" wp14:anchorId="5F6FBBDD" wp14:editId="3D2FBDBE">
             <wp:extent cx="5943600" cy="2981325"/>
             <wp:effectExtent l="0" t="0" r="0" b="0"/>
             <wp:docPr id="792516126" name="drawing"/>
             <wp:cNvGraphicFramePr>
-              <a:graphicFrameLocks noChangeAspect="1"/>
+              <a:graphicFrameLocks xmlns:a="http://schemas.openxmlformats.org/drawingml/2006/main" noChangeAspect="1"/>
             </wp:cNvGraphicFramePr>
-            <a:graphic>
-              <a:graphicData xmlns:a="http://schemas.openxmlformats.org/drawingml/2006/main" uri="http://schemas.openxmlformats.org/drawingml/2006/picture">
+            <a:graphic xmlns:a="http://schemas.openxmlformats.org/drawingml/2006/main">
+              <a:graphicData uri="http://schemas.openxmlformats.org/drawingml/2006/picture">
                 <pic:pic xmlns:pic="http://schemas.openxmlformats.org/drawingml/2006/picture">
                   <pic:nvPicPr>
                     <pic:cNvPr id="792516126" name=""/>
                     <pic:cNvPicPr/>
                   </pic:nvPicPr>
                   <pic:blipFill>
-                    <a:blip xmlns:r="http://schemas.openxmlformats.org/officeDocument/2006/relationships" r:embed="rId321780887">
+                    <a:blip r:embed="rId18" cstate="print">
                       <a:extLst>
-                        <a:ext xmlns:a="http://schemas.openxmlformats.org/drawingml/2006/main" uri="{28A0092B-C50C-407E-A947-70E740481C1C}">
+                        <a:ext uri="{28A0092B-C50C-407E-A947-70E740481C1C}">
                           <a14:useLocalDpi xmlns:a14="http://schemas.microsoft.com/office/drawing/2010/main" val="0"/>
                         </a:ext>
                       </a:extLst>
@@ -918,35 +866,36 @@
         </w:drawing>
       </w:r>
       <w:r>
-        <w:rPr/>
         <w:t>R</w:t>
       </w:r>
       <w:r>
-        <w:rPr/>
         <w:t>ight-click in the folder, then Create -&gt; Level -&gt; Chunk Data</w:t>
       </w:r>
     </w:p>
     <w:p>
       <w:r>
+        <w:rPr>
+          <w:noProof/>
+        </w:rPr>
         <w:drawing>
-          <wp:inline wp14:editId="076985F0" wp14:anchorId="1FACDF53">
+          <wp:inline distT="0" distB="0" distL="0" distR="0" wp14:anchorId="1FACDF53" wp14:editId="217FC185">
             <wp:extent cx="5943600" cy="3600450"/>
             <wp:effectExtent l="0" t="0" r="0" b="0"/>
             <wp:docPr id="1847529177" name="drawing"/>
             <wp:cNvGraphicFramePr>
-              <a:graphicFrameLocks noChangeAspect="1"/>
+              <a:graphicFrameLocks xmlns:a="http://schemas.openxmlformats.org/drawingml/2006/main" noChangeAspect="1"/>
             </wp:cNvGraphicFramePr>
-            <a:graphic>
-              <a:graphicData xmlns:a="http://schemas.openxmlformats.org/drawingml/2006/main" uri="http://schemas.openxmlformats.org/drawingml/2006/picture">
+            <a:graphic xmlns:a="http://schemas.openxmlformats.org/drawingml/2006/main">
+              <a:graphicData uri="http://schemas.openxmlformats.org/drawingml/2006/picture">
                 <pic:pic xmlns:pic="http://schemas.openxmlformats.org/drawingml/2006/picture">
                   <pic:nvPicPr>
                     <pic:cNvPr id="1847529177" name=""/>
                     <pic:cNvPicPr/>
                   </pic:nvPicPr>
                   <pic:blipFill>
-                    <a:blip xmlns:r="http://schemas.openxmlformats.org/officeDocument/2006/relationships" r:embed="rId559614833">
+                    <a:blip r:embed="rId19" cstate="print">
                       <a:extLst>
-                        <a:ext xmlns:a="http://schemas.openxmlformats.org/drawingml/2006/main" uri="{28A0092B-C50C-407E-A947-70E740481C1C}">
+                        <a:ext uri="{28A0092B-C50C-407E-A947-70E740481C1C}">
                           <a14:useLocalDpi xmlns:a14="http://schemas.microsoft.com/office/drawing/2010/main" val="0"/>
                         </a:ext>
                       </a:extLst>
@@ -971,32 +920,35 @@
         </w:drawing>
       </w:r>
       <w:r>
-        <w:rPr/>
         <w:t>Then assign the Prefab (in this case, Chunk 30) from the Assets tab to the “Prefab” in the Inspector.</w:t>
       </w:r>
     </w:p>
     <w:p/>
     <w:p>
       <w:r>
+        <w:rPr>
+          <w:noProof/>
+        </w:rPr>
+        <w:lastRenderedPageBreak/>
         <w:drawing>
-          <wp:inline wp14:editId="58DAAB6F" wp14:anchorId="56D215CD">
+          <wp:inline distT="0" distB="0" distL="0" distR="0" wp14:anchorId="56D215CD" wp14:editId="7D6B8950">
             <wp:extent cx="5943600" cy="3105150"/>
             <wp:effectExtent l="0" t="0" r="0" b="0"/>
             <wp:docPr id="589338098" name="drawing"/>
             <wp:cNvGraphicFramePr>
-              <a:graphicFrameLocks noChangeAspect="1"/>
+              <a:graphicFrameLocks xmlns:a="http://schemas.openxmlformats.org/drawingml/2006/main" noChangeAspect="1"/>
             </wp:cNvGraphicFramePr>
-            <a:graphic>
-              <a:graphicData xmlns:a="http://schemas.openxmlformats.org/drawingml/2006/main" uri="http://schemas.openxmlformats.org/drawingml/2006/picture">
+            <a:graphic xmlns:a="http://schemas.openxmlformats.org/drawingml/2006/main">
+              <a:graphicData uri="http://schemas.openxmlformats.org/drawingml/2006/picture">
                 <pic:pic xmlns:pic="http://schemas.openxmlformats.org/drawingml/2006/picture">
                   <pic:nvPicPr>
                     <pic:cNvPr id="589338098" name=""/>
                     <pic:cNvPicPr/>
                   </pic:nvPicPr>
                   <pic:blipFill>
-                    <a:blip xmlns:r="http://schemas.openxmlformats.org/officeDocument/2006/relationships" r:embed="rId1196944719">
+                    <a:blip r:embed="rId20" cstate="print">
                       <a:extLst>
-                        <a:ext xmlns:a="http://schemas.openxmlformats.org/drawingml/2006/main" uri="{28A0092B-C50C-407E-A947-70E740481C1C}">
+                        <a:ext uri="{28A0092B-C50C-407E-A947-70E740481C1C}">
                           <a14:useLocalDpi xmlns:a14="http://schemas.microsoft.com/office/drawing/2010/main" val="0"/>
                         </a:ext>
                       </a:extLst>
@@ -1021,40 +973,21 @@
         </w:drawing>
       </w:r>
       <w:r>
-        <w:rPr/>
-        <w:t xml:space="preserve">And finally, in the Level object in AutoRunnerInfinite, there are three </w:t>
-      </w:r>
-      <w:r>
-        <w:rPr/>
-        <w:t>different groups</w:t>
-      </w:r>
-      <w:r>
-        <w:rPr/>
-        <w:t xml:space="preserve"> of chunks: Easy, Medium, and Hard. Click the “+” to add a new </w:t>
-      </w:r>
-      <w:r>
-        <w:rPr/>
+        <w:t xml:space="preserve">And finally, in the Level object in AutoRunnerInfinite, there are three different groups of chunks: Easy, Medium, and Hard. Click the “+” to add a new </w:t>
+      </w:r>
+      <w:r>
         <w:t>slot, then fill it with the chunk you just made.</w:t>
       </w:r>
     </w:p>
     <w:p/>
     <w:p>
       <w:r>
-        <w:rPr/>
-        <w:t xml:space="preserve">Depending on the </w:t>
-      </w:r>
-      <w:r>
-        <w:rPr/>
-        <w:t>magnitude</w:t>
-      </w:r>
-      <w:r>
-        <w:rPr/>
-        <w:t xml:space="preserve"> of weight that you set for that chunk, you should now see it in the rotation of chunks that appear during a run. </w:t>
+        <w:t xml:space="preserve">Depending on the magnitude of weight that you set for that chunk, you should now see it in the rotation of chunks that appear during a run. </w:t>
       </w:r>
     </w:p>
     <w:p/>
     <w:sectPr>
-      <w:pgSz w:w="12240" w:h="15840" w:orient="portrait"/>
+      <w:pgSz w:w="12240" w:h="15840"/>
       <w:pgMar w:top="1440" w:right="1440" w:bottom="1440" w:left="1440" w:header="720" w:footer="720" w:gutter="0"/>
       <w:cols w:space="720"/>
       <w:docGrid w:linePitch="360"/>
@@ -1064,11 +997,11 @@
 </file>
 
 <file path=word/styles.xml><?xml version="1.0" encoding="utf-8"?>
-<w:styles xmlns:wp14="http://schemas.microsoft.com/office/word/2010/wordprocessingDrawing" xmlns:mc="http://schemas.openxmlformats.org/markup-compatibility/2006" xmlns:r="http://schemas.openxmlformats.org/officeDocument/2006/relationships" xmlns:w="http://schemas.openxmlformats.org/wordprocessingml/2006/main" xmlns:w14="http://schemas.microsoft.com/office/word/2010/wordml" xmlns:w15="http://schemas.microsoft.com/office/word/2012/wordml" xmlns:w16se="http://schemas.microsoft.com/office/word/2015/wordml/symex" xmlns:w16cid="http://schemas.microsoft.com/office/word/2016/wordml/cid" xmlns:w16="http://schemas.microsoft.com/office/word/2018/wordml" xmlns:w16cex="http://schemas.microsoft.com/office/word/2018/wordml/cex" xmlns:w16sdtdh="http://schemas.microsoft.com/office/word/2020/wordml/sdtdatahash" xmlns:w16sdtfl="http://schemas.microsoft.com/office/word/2024/wordml/sdtformatlock" mc:Ignorable="w14 w15 wp14 w16se w16cid w16 w16cex w16sdtdh w16sdtfl">
+<w:styles xmlns:mc="http://schemas.openxmlformats.org/markup-compatibility/2006" xmlns:r="http://schemas.openxmlformats.org/officeDocument/2006/relationships" xmlns:w="http://schemas.openxmlformats.org/wordprocessingml/2006/main" xmlns:w14="http://schemas.microsoft.com/office/word/2010/wordml" xmlns:w15="http://schemas.microsoft.com/office/word/2012/wordml" xmlns:w16cex="http://schemas.microsoft.com/office/word/2018/wordml/cex" xmlns:w16cid="http://schemas.microsoft.com/office/word/2016/wordml/cid" xmlns:w16="http://schemas.microsoft.com/office/word/2018/wordml" xmlns:w16du="http://schemas.microsoft.com/office/word/2023/wordml/word16du" xmlns:w16sdtdh="http://schemas.microsoft.com/office/word/2020/wordml/sdtdatahash" xmlns:w16se="http://schemas.microsoft.com/office/word/2015/wordml/symex" mc:Ignorable="w14 w15 w16se w16cid w16 w16cex w16sdtdh w16du">
   <w:docDefaults>
     <w:rPrDefault>
       <w:rPr>
-        <w:rFonts w:asciiTheme="minorHAnsi" w:hAnsiTheme="minorHAnsi" w:eastAsiaTheme="minorEastAsia" w:cstheme="minorBidi"/>
+        <w:rFonts w:asciiTheme="minorHAnsi" w:eastAsiaTheme="minorEastAsia" w:hAnsiTheme="minorHAnsi" w:cstheme="minorBidi"/>
         <w:sz w:val="24"/>
         <w:szCs w:val="24"/>
         <w:lang w:val="en-US" w:eastAsia="ja-JP" w:bidi="ar-SA"/>
@@ -1080,17 +1013,17 @@
       </w:pPr>
     </w:pPrDefault>
   </w:docDefaults>
-  <w:latentStyles w:defLockedState="0" w:defUIPriority="99" w:defSemiHidden="0" w:defUnhideWhenUsed="0" w:defQFormat="0" w:count="371">
+  <w:latentStyles w:defLockedState="0" w:defUIPriority="99" w:defSemiHidden="0" w:defUnhideWhenUsed="0" w:defQFormat="0" w:count="376">
     <w:lsdException w:name="Normal" w:uiPriority="0" w:qFormat="1"/>
     <w:lsdException w:name="heading 1" w:uiPriority="9" w:qFormat="1"/>
-    <w:lsdException w:name="heading 2" w:uiPriority="9" w:semiHidden="1" w:unhideWhenUsed="1" w:qFormat="1"/>
-    <w:lsdException w:name="heading 3" w:uiPriority="9" w:semiHidden="1" w:unhideWhenUsed="1" w:qFormat="1"/>
-    <w:lsdException w:name="heading 4" w:uiPriority="9" w:semiHidden="1" w:unhideWhenUsed="1" w:qFormat="1"/>
-    <w:lsdException w:name="heading 5" w:uiPriority="9" w:semiHidden="1" w:unhideWhenUsed="1" w:qFormat="1"/>
-    <w:lsdException w:name="heading 6" w:uiPriority="9" w:semiHidden="1" w:unhideWhenUsed="1" w:qFormat="1"/>
-    <w:lsdException w:name="heading 7" w:uiPriority="9" w:semiHidden="1" w:unhideWhenUsed="1" w:qFormat="1"/>
-    <w:lsdException w:name="heading 8" w:uiPriority="9" w:semiHidden="1" w:unhideWhenUsed="1" w:qFormat="1"/>
-    <w:lsdException w:name="heading 9" w:uiPriority="9" w:semiHidden="1" w:unhideWhenUsed="1" w:qFormat="1"/>
+    <w:lsdException w:name="heading 2" w:semiHidden="1" w:uiPriority="9" w:unhideWhenUsed="1" w:qFormat="1"/>
+    <w:lsdException w:name="heading 3" w:semiHidden="1" w:uiPriority="9" w:unhideWhenUsed="1" w:qFormat="1"/>
+    <w:lsdException w:name="heading 4" w:semiHidden="1" w:uiPriority="9" w:unhideWhenUsed="1" w:qFormat="1"/>
+    <w:lsdException w:name="heading 5" w:semiHidden="1" w:uiPriority="9" w:unhideWhenUsed="1" w:qFormat="1"/>
+    <w:lsdException w:name="heading 6" w:semiHidden="1" w:uiPriority="9" w:unhideWhenUsed="1" w:qFormat="1"/>
+    <w:lsdException w:name="heading 7" w:semiHidden="1" w:uiPriority="9" w:unhideWhenUsed="1" w:qFormat="1"/>
+    <w:lsdException w:name="heading 8" w:semiHidden="1" w:uiPriority="9" w:unhideWhenUsed="1" w:qFormat="1"/>
+    <w:lsdException w:name="heading 9" w:semiHidden="1" w:uiPriority="9" w:unhideWhenUsed="1" w:qFormat="1"/>
     <w:lsdException w:name="index 1" w:semiHidden="1" w:unhideWhenUsed="1"/>
     <w:lsdException w:name="index 2" w:semiHidden="1" w:unhideWhenUsed="1"/>
     <w:lsdException w:name="index 3" w:semiHidden="1" w:unhideWhenUsed="1"/>
@@ -1100,22 +1033,22 @@
     <w:lsdException w:name="index 7" w:semiHidden="1" w:unhideWhenUsed="1"/>
     <w:lsdException w:name="index 8" w:semiHidden="1" w:unhideWhenUsed="1"/>
     <w:lsdException w:name="index 9" w:semiHidden="1" w:unhideWhenUsed="1"/>
-    <w:lsdException w:name="toc 1" w:uiPriority="39" w:semiHidden="1" w:unhideWhenUsed="1"/>
-    <w:lsdException w:name="toc 2" w:uiPriority="39" w:semiHidden="1" w:unhideWhenUsed="1"/>
-    <w:lsdException w:name="toc 3" w:uiPriority="39" w:semiHidden="1" w:unhideWhenUsed="1"/>
-    <w:lsdException w:name="toc 4" w:uiPriority="39" w:semiHidden="1" w:unhideWhenUsed="1"/>
-    <w:lsdException w:name="toc 5" w:uiPriority="39" w:semiHidden="1" w:unhideWhenUsed="1"/>
-    <w:lsdException w:name="toc 6" w:uiPriority="39" w:semiHidden="1" w:unhideWhenUsed="1"/>
-    <w:lsdException w:name="toc 7" w:uiPriority="39" w:semiHidden="1" w:unhideWhenUsed="1"/>
-    <w:lsdException w:name="toc 8" w:uiPriority="39" w:semiHidden="1" w:unhideWhenUsed="1"/>
-    <w:lsdException w:name="toc 9" w:uiPriority="39" w:semiHidden="1" w:unhideWhenUsed="1"/>
+    <w:lsdException w:name="toc 1" w:semiHidden="1" w:uiPriority="39" w:unhideWhenUsed="1"/>
+    <w:lsdException w:name="toc 2" w:semiHidden="1" w:uiPriority="39" w:unhideWhenUsed="1"/>
+    <w:lsdException w:name="toc 3" w:semiHidden="1" w:uiPriority="39" w:unhideWhenUsed="1"/>
+    <w:lsdException w:name="toc 4" w:semiHidden="1" w:uiPriority="39" w:unhideWhenUsed="1"/>
+    <w:lsdException w:name="toc 5" w:semiHidden="1" w:uiPriority="39" w:unhideWhenUsed="1"/>
+    <w:lsdException w:name="toc 6" w:semiHidden="1" w:uiPriority="39" w:unhideWhenUsed="1"/>
+    <w:lsdException w:name="toc 7" w:semiHidden="1" w:uiPriority="39" w:unhideWhenUsed="1"/>
+    <w:lsdException w:name="toc 8" w:semiHidden="1" w:uiPriority="39" w:unhideWhenUsed="1"/>
+    <w:lsdException w:name="toc 9" w:semiHidden="1" w:uiPriority="39" w:unhideWhenUsed="1"/>
     <w:lsdException w:name="Normal Indent" w:semiHidden="1" w:unhideWhenUsed="1"/>
     <w:lsdException w:name="footnote text" w:semiHidden="1" w:unhideWhenUsed="1"/>
     <w:lsdException w:name="annotation text" w:semiHidden="1" w:unhideWhenUsed="1"/>
     <w:lsdException w:name="header" w:semiHidden="1" w:unhideWhenUsed="1"/>
     <w:lsdException w:name="footer" w:semiHidden="1" w:unhideWhenUsed="1"/>
     <w:lsdException w:name="index heading" w:semiHidden="1" w:unhideWhenUsed="1"/>
-    <w:lsdException w:name="caption" w:uiPriority="35" w:semiHidden="1" w:unhideWhenUsed="1" w:qFormat="1"/>
+    <w:lsdException w:name="caption" w:semiHidden="1" w:uiPriority="35" w:unhideWhenUsed="1" w:qFormat="1"/>
     <w:lsdException w:name="table of figures" w:semiHidden="1" w:unhideWhenUsed="1"/>
     <w:lsdException w:name="envelope address" w:semiHidden="1" w:unhideWhenUsed="1"/>
     <w:lsdException w:name="envelope return" w:semiHidden="1" w:unhideWhenUsed="1"/>
@@ -1146,7 +1079,7 @@
     <w:lsdException w:name="Title" w:uiPriority="10" w:qFormat="1"/>
     <w:lsdException w:name="Closing" w:semiHidden="1" w:unhideWhenUsed="1"/>
     <w:lsdException w:name="Signature" w:semiHidden="1" w:unhideWhenUsed="1"/>
-    <w:lsdException w:name="Default Paragraph Font" w:uiPriority="1" w:semiHidden="1" w:unhideWhenUsed="1"/>
+    <w:lsdException w:name="Default Paragraph Font" w:semiHidden="1" w:uiPriority="1" w:unhideWhenUsed="1"/>
     <w:lsdException w:name="Body Text" w:semiHidden="1" w:unhideWhenUsed="1"/>
     <w:lsdException w:name="Body Text Indent" w:semiHidden="1" w:unhideWhenUsed="1"/>
     <w:lsdException w:name="List Continue" w:semiHidden="1" w:unhideWhenUsed="1"/>
@@ -1346,8 +1279,8 @@
     <w:lsdException w:name="Subtle Reference" w:uiPriority="31" w:qFormat="1"/>
     <w:lsdException w:name="Intense Reference" w:uiPriority="32" w:qFormat="1"/>
     <w:lsdException w:name="Book Title" w:uiPriority="33" w:qFormat="1"/>
-    <w:lsdException w:name="Bibliography" w:uiPriority="37" w:semiHidden="1" w:unhideWhenUsed="1"/>
-    <w:lsdException w:name="TOC Heading" w:uiPriority="39" w:semiHidden="1" w:unhideWhenUsed="1" w:qFormat="1"/>
+    <w:lsdException w:name="Bibliography" w:semiHidden="1" w:uiPriority="37" w:unhideWhenUsed="1"/>
+    <w:lsdException w:name="TOC Heading" w:semiHidden="1" w:uiPriority="39" w:unhideWhenUsed="1" w:qFormat="1"/>
     <w:lsdException w:name="Plain Table 1" w:uiPriority="41"/>
     <w:lsdException w:name="Plain Table 2" w:uiPriority="42"/>
     <w:lsdException w:name="Plain Table 3" w:uiPriority="43"/>
@@ -1452,18 +1385,23 @@
     <w:lsdException w:name="List Table 5 Dark Accent 6" w:uiPriority="50"/>
     <w:lsdException w:name="List Table 6 Colorful Accent 6" w:uiPriority="51"/>
     <w:lsdException w:name="List Table 7 Colorful Accent 6" w:uiPriority="52"/>
+    <w:lsdException w:name="Mention" w:semiHidden="1" w:unhideWhenUsed="1"/>
+    <w:lsdException w:name="Smart Hyperlink" w:semiHidden="1" w:unhideWhenUsed="1"/>
+    <w:lsdException w:name="Hashtag" w:semiHidden="1" w:unhideWhenUsed="1"/>
+    <w:lsdException w:name="Unresolved Mention" w:semiHidden="1" w:unhideWhenUsed="1"/>
+    <w:lsdException w:name="Smart Link" w:semiHidden="1" w:unhideWhenUsed="1"/>
   </w:latentStyles>
-  <w:style w:type="paragraph" w:styleId="Normal" w:default="1">
+  <w:style w:type="paragraph" w:default="1" w:styleId="Normal">
     <w:name w:val="Normal"/>
     <w:qFormat/>
   </w:style>
-  <w:style w:type="character" w:styleId="DefaultParagraphFont" w:default="1">
+  <w:style w:type="character" w:default="1" w:styleId="DefaultParagraphFont">
     <w:name w:val="Default Paragraph Font"/>
     <w:uiPriority w:val="1"/>
     <w:semiHidden/>
     <w:unhideWhenUsed/>
   </w:style>
-  <w:style w:type="table" w:styleId="TableNormal" w:default="1">
+  <w:style w:type="table" w:default="1" w:styleId="TableNormal">
     <w:name w:val="Normal Table"/>
     <w:uiPriority w:val="99"/>
     <w:semiHidden/>
@@ -1478,7 +1416,7 @@
       </w:tblCellMar>
     </w:tblPr>
   </w:style>
-  <w:style w:type="numbering" w:styleId="NoList" w:default="1">
+  <w:style w:type="numbering" w:default="1" w:styleId="NoList">
     <w:name w:val="No List"/>
     <w:uiPriority w:val="99"/>
     <w:semiHidden/>
@@ -1488,7 +1426,7 @@
 </file>
 
 <file path=word/theme/theme1.xml><?xml version="1.0" encoding="utf-8"?>
-<a:theme xmlns:thm15="http://schemas.microsoft.com/office/thememl/2012/main" xmlns:a="http://schemas.openxmlformats.org/drawingml/2006/main" name="Office Theme">
+<a:theme xmlns:a="http://schemas.openxmlformats.org/drawingml/2006/main" name="Office Theme">
   <a:themeElements>
     <a:clrScheme name="Office">
       <a:dk1>

</xml_diff>